<commit_message>
Versão com os indíces que faltavam
</commit_message>
<xml_diff>
--- a/Indicadores desatualizados IPPLAN.docx
+++ b/Indicadores desatualizados IPPLAN.docx
@@ -1544,158 +1544,791 @@
               <w:rPr>
                 <w:rtl w:val="0"/>
               </w:rPr>
-            </w:r>
-          </w:p>
-        </w:tc>
-        <w:tc>
-          <w:tcPr>
-            <w:vAlign w:val="center"/>
-          </w:tcPr>
-          <w:p>
-            <w:pPr>
-              <w:widowControl w:val="0"/>
-              <w:spacing w:line="240" w:lineRule="auto"/>
-              <w:jc w:val="center"/>
-              <w:rPr/>
-            </w:pPr>
-            <w:r>
-              <w:rPr>
-                <w:rtl w:val="0"/>
-              </w:rPr>
-            </w:r>
-          </w:p>
-        </w:tc>
-        <w:tc>
-          <w:tcPr>
-            <w:vAlign w:val="center"/>
-          </w:tcPr>
-          <w:p>
-            <w:pPr>
-              <w:widowControl w:val="0"/>
-              <w:spacing w:line="240" w:lineRule="auto"/>
-              <w:jc w:val="center"/>
-              <w:rPr/>
-            </w:pPr>
-            <w:r>
-              <w:rPr>
-                <w:rtl w:val="0"/>
-              </w:rPr>
-            </w:r>
-          </w:p>
-        </w:tc>
-      </w:tr>
-      <w:tr>
-        <w:trPr>
-          <w:cantSplit w:val="0"/>
-          <w:tblHeader w:val="0"/>
-        </w:trPr>
-        <w:tc>
-          <w:tcPr/>
-          <w:p>
-            <w:pPr>
-              <w:widowControl w:val="0"/>
-              <w:spacing w:line="240" w:lineRule="auto"/>
-              <w:jc w:val="both"/>
-              <w:rPr/>
-            </w:pPr>
-            <w:r>
-              <w:rPr>
-                <w:rtl w:val="0"/>
-              </w:rPr>
-            </w:r>
-          </w:p>
-        </w:tc>
-        <w:tc>
-          <w:tcPr>
-            <w:vAlign w:val="center"/>
-          </w:tcPr>
-          <w:p>
-            <w:pPr>
-              <w:widowControl w:val="0"/>
-              <w:spacing w:line="240" w:lineRule="auto"/>
-              <w:jc w:val="center"/>
-              <w:rPr/>
-            </w:pPr>
-            <w:r>
-              <w:rPr>
-                <w:rtl w:val="0"/>
-              </w:rPr>
-            </w:r>
-          </w:p>
-        </w:tc>
-        <w:tc>
-          <w:tcPr>
-            <w:vAlign w:val="center"/>
-          </w:tcPr>
-          <w:p>
-            <w:pPr>
-              <w:widowControl w:val="0"/>
-              <w:spacing w:line="240" w:lineRule="auto"/>
-              <w:jc w:val="center"/>
-              <w:rPr/>
-            </w:pPr>
-            <w:r>
-              <w:rPr>
-                <w:rtl w:val="0"/>
-              </w:rPr>
-            </w:r>
-          </w:p>
-        </w:tc>
-      </w:tr>
-      <w:tr>
-        <w:trPr>
-          <w:cantSplit w:val="0"/>
-          <w:tblHeader w:val="0"/>
-        </w:trPr>
-        <w:tc>
-          <w:tcPr/>
-          <w:p>
-            <w:pPr>
-              <w:widowControl w:val="0"/>
-              <w:spacing w:line="240" w:lineRule="auto"/>
-              <w:jc w:val="both"/>
-              <w:rPr/>
-            </w:pPr>
-            <w:r>
-              <w:rPr>
-                <w:rtl w:val="0"/>
-              </w:rPr>
-            </w:r>
-          </w:p>
-        </w:tc>
-        <w:tc>
-          <w:tcPr>
-            <w:vAlign w:val="center"/>
-          </w:tcPr>
-          <w:p>
-            <w:pPr>
-              <w:widowControl w:val="0"/>
-              <w:spacing w:line="240" w:lineRule="auto"/>
-              <w:jc w:val="center"/>
-              <w:rPr/>
-            </w:pPr>
-            <w:r>
-              <w:rPr>
-                <w:rtl w:val="0"/>
-              </w:rPr>
-            </w:r>
-          </w:p>
-        </w:tc>
-        <w:tc>
-          <w:tcPr>
-            <w:vAlign w:val="center"/>
-          </w:tcPr>
-          <w:p>
-            <w:pPr>
-              <w:widowControl w:val="0"/>
-              <w:spacing w:line="240" w:lineRule="auto"/>
-              <w:jc w:val="center"/>
-              <w:rPr/>
-            </w:pPr>
-            <w:r>
-              <w:rPr>
-                <w:rtl w:val="0"/>
-              </w:rPr>
+              <w:t xml:space="preserve">Texto do Atlas do Desenvolvimento Humano no Brasil 2013</w:t>
+            </w:r>
+          </w:p>
+        </w:tc>
+        <w:tc>
+          <w:tcPr>
+            <w:vAlign w:val="center"/>
+          </w:tcPr>
+          <w:p>
+            <w:pPr>
+              <w:widowControl w:val="0"/>
+              <w:spacing w:line="240" w:lineRule="auto"/>
+              <w:jc w:val="center"/>
+              <w:rPr/>
+            </w:pPr>
+            <w:r>
+              <w:rPr>
+                <w:rtl w:val="0"/>
+              </w:rPr>
+              <w:t xml:space="preserve">2013</w:t>
+            </w:r>
+          </w:p>
+        </w:tc>
+        <w:tc>
+          <w:tcPr>
+            <w:vAlign w:val="center"/>
+          </w:tcPr>
+          <w:p>
+            <w:pPr>
+              <w:widowControl w:val="0"/>
+              <w:spacing w:line="240" w:lineRule="auto"/>
+              <w:jc w:val="center"/>
+              <w:rPr/>
+            </w:pPr>
+            <w:r>
+              <w:rPr>
+                <w:rtl w:val="0"/>
+              </w:rPr>
+              <w:t xml:space="preserve">39</w:t>
+            </w:r>
+          </w:p>
+        </w:tc>
+      </w:tr>
+      <w:tr>
+        <w:trPr>
+          <w:cantSplit w:val="0"/>
+          <w:tblHeader w:val="0"/>
+        </w:trPr>
+        <w:tc>
+          <w:tcPr/>
+          <w:p>
+            <w:pPr>
+              <w:widowControl w:val="0"/>
+              <w:spacing w:line="240" w:lineRule="auto"/>
+              <w:jc w:val="both"/>
+              <w:rPr/>
+            </w:pPr>
+            <w:r>
+              <w:rPr>
+                <w:rtl w:val="0"/>
+              </w:rPr>
+              <w:t xml:space="preserve">Texto do </w:t>
+            </w:r>
+            <w:r>
+              <w:rPr>
+                <w:rFonts w:ascii="Calibri" w:cs="Calibri" w:eastAsia="Calibri" w:hAnsi="Calibri"/>
+                <w:sz w:val="24"/>
+                <w:szCs w:val="24"/>
+                <w:rtl w:val="0"/>
+              </w:rPr>
+              <w:t xml:space="preserve">PNUD, IDH</w:t>
+            </w:r>
+            <w:r>
+              <w:rPr>
+                <w:rtl w:val="0"/>
+              </w:rPr>
+            </w:r>
+          </w:p>
+        </w:tc>
+        <w:tc>
+          <w:tcPr>
+            <w:vAlign w:val="center"/>
+          </w:tcPr>
+          <w:p>
+            <w:pPr>
+              <w:widowControl w:val="0"/>
+              <w:spacing w:line="240" w:lineRule="auto"/>
+              <w:jc w:val="center"/>
+              <w:rPr/>
+            </w:pPr>
+            <w:r>
+              <w:rPr>
+                <w:rtl w:val="0"/>
+              </w:rPr>
+              <w:t xml:space="preserve">2015</w:t>
+            </w:r>
+          </w:p>
+        </w:tc>
+        <w:tc>
+          <w:tcPr>
+            <w:vAlign w:val="center"/>
+          </w:tcPr>
+          <w:p>
+            <w:pPr>
+              <w:widowControl w:val="0"/>
+              <w:spacing w:line="240" w:lineRule="auto"/>
+              <w:jc w:val="center"/>
+              <w:rPr/>
+            </w:pPr>
+            <w:r>
+              <w:rPr>
+                <w:rtl w:val="0"/>
+              </w:rPr>
+              <w:t xml:space="preserve">40</w:t>
+            </w:r>
+          </w:p>
+        </w:tc>
+      </w:tr>
+      <w:tr>
+        <w:trPr>
+          <w:cantSplit w:val="0"/>
+          <w:tblHeader w:val="0"/>
+        </w:trPr>
+        <w:tc>
+          <w:tcPr/>
+          <w:p>
+            <w:pPr>
+              <w:widowControl w:val="0"/>
+              <w:spacing w:line="240" w:lineRule="auto"/>
+              <w:jc w:val="both"/>
+              <w:rPr/>
+            </w:pPr>
+            <w:r>
+              <w:rPr>
+                <w:rtl w:val="0"/>
+              </w:rPr>
+              <w:t xml:space="preserve">Índice de Desenvolvimento Humano Municipal e seus componentes de Campo Mourão – PR</w:t>
+            </w:r>
+          </w:p>
+        </w:tc>
+        <w:tc>
+          <w:tcPr>
+            <w:vAlign w:val="center"/>
+          </w:tcPr>
+          <w:p>
+            <w:pPr>
+              <w:widowControl w:val="0"/>
+              <w:spacing w:line="240" w:lineRule="auto"/>
+              <w:jc w:val="center"/>
+              <w:rPr/>
+            </w:pPr>
+            <w:r>
+              <w:rPr>
+                <w:rtl w:val="0"/>
+              </w:rPr>
+              <w:t xml:space="preserve">2010</w:t>
+            </w:r>
+          </w:p>
+        </w:tc>
+        <w:tc>
+          <w:tcPr>
+            <w:vAlign w:val="center"/>
+          </w:tcPr>
+          <w:p>
+            <w:pPr>
+              <w:widowControl w:val="0"/>
+              <w:spacing w:line="240" w:lineRule="auto"/>
+              <w:jc w:val="center"/>
+              <w:rPr/>
+            </w:pPr>
+            <w:r>
+              <w:rPr>
+                <w:rtl w:val="0"/>
+              </w:rPr>
+              <w:t xml:space="preserve">40</w:t>
+            </w:r>
+          </w:p>
+        </w:tc>
+      </w:tr>
+      <w:tr>
+        <w:trPr>
+          <w:cantSplit w:val="0"/>
+          <w:tblHeader w:val="0"/>
+        </w:trPr>
+        <w:tc>
+          <w:tcPr/>
+          <w:p>
+            <w:pPr>
+              <w:widowControl w:val="0"/>
+              <w:spacing w:line="240" w:lineRule="auto"/>
+              <w:jc w:val="both"/>
+              <w:rPr/>
+            </w:pPr>
+            <w:r>
+              <w:rPr>
+                <w:rtl w:val="0"/>
+              </w:rPr>
+              <w:t xml:space="preserve">Matrículas na educação especial segundo a modalidade de ensino e a dependência administrativa – 2017</w:t>
+            </w:r>
+          </w:p>
+        </w:tc>
+        <w:tc>
+          <w:tcPr>
+            <w:vAlign w:val="center"/>
+          </w:tcPr>
+          <w:p>
+            <w:pPr>
+              <w:widowControl w:val="0"/>
+              <w:spacing w:line="240" w:lineRule="auto"/>
+              <w:jc w:val="center"/>
+              <w:rPr/>
+            </w:pPr>
+            <w:r>
+              <w:rPr>
+                <w:rtl w:val="0"/>
+              </w:rPr>
+              <w:t xml:space="preserve">2017</w:t>
+            </w:r>
+          </w:p>
+        </w:tc>
+        <w:tc>
+          <w:tcPr>
+            <w:vAlign w:val="center"/>
+          </w:tcPr>
+          <w:p>
+            <w:pPr>
+              <w:widowControl w:val="0"/>
+              <w:spacing w:line="240" w:lineRule="auto"/>
+              <w:jc w:val="center"/>
+              <w:rPr/>
+            </w:pPr>
+            <w:r>
+              <w:rPr>
+                <w:rtl w:val="0"/>
+              </w:rPr>
+              <w:t xml:space="preserve">43</w:t>
+            </w:r>
+          </w:p>
+        </w:tc>
+      </w:tr>
+      <w:tr>
+        <w:trPr>
+          <w:cantSplit w:val="0"/>
+          <w:tblHeader w:val="0"/>
+        </w:trPr>
+        <w:tc>
+          <w:tcPr/>
+          <w:p>
+            <w:pPr>
+              <w:widowControl w:val="0"/>
+              <w:spacing w:line="240" w:lineRule="auto"/>
+              <w:jc w:val="both"/>
+              <w:rPr/>
+            </w:pPr>
+            <w:r>
+              <w:rPr>
+                <w:rtl w:val="0"/>
+              </w:rPr>
+              <w:t xml:space="preserve">Cursos de graduação ofertados na modalidade EAD – 2019</w:t>
+            </w:r>
+          </w:p>
+        </w:tc>
+        <w:tc>
+          <w:tcPr>
+            <w:vAlign w:val="center"/>
+          </w:tcPr>
+          <w:p>
+            <w:pPr>
+              <w:widowControl w:val="0"/>
+              <w:spacing w:line="240" w:lineRule="auto"/>
+              <w:jc w:val="center"/>
+              <w:rPr/>
+            </w:pPr>
+            <w:r>
+              <w:rPr>
+                <w:rtl w:val="0"/>
+              </w:rPr>
+              <w:t xml:space="preserve">2019</w:t>
+            </w:r>
+          </w:p>
+        </w:tc>
+        <w:tc>
+          <w:tcPr>
+            <w:vAlign w:val="center"/>
+          </w:tcPr>
+          <w:p>
+            <w:pPr>
+              <w:widowControl w:val="0"/>
+              <w:spacing w:line="240" w:lineRule="auto"/>
+              <w:jc w:val="center"/>
+              <w:rPr/>
+            </w:pPr>
+            <w:r>
+              <w:rPr>
+                <w:rtl w:val="0"/>
+              </w:rPr>
+              <w:t xml:space="preserve">48</w:t>
+            </w:r>
+          </w:p>
+        </w:tc>
+      </w:tr>
+      <w:tr>
+        <w:trPr>
+          <w:cantSplit w:val="0"/>
+          <w:tblHeader w:val="0"/>
+        </w:trPr>
+        <w:tc>
+          <w:tcPr/>
+          <w:p>
+            <w:pPr>
+              <w:widowControl w:val="0"/>
+              <w:spacing w:line="240" w:lineRule="auto"/>
+              <w:jc w:val="both"/>
+              <w:rPr/>
+            </w:pPr>
+            <w:r>
+              <w:rPr>
+                <w:rtl w:val="0"/>
+              </w:rPr>
+              <w:t xml:space="preserve">Comparativos de curso superior lato sensu e stricto sensu presencial e EAD</w:t>
+            </w:r>
+          </w:p>
+        </w:tc>
+        <w:tc>
+          <w:tcPr>
+            <w:vAlign w:val="center"/>
+          </w:tcPr>
+          <w:p>
+            <w:pPr>
+              <w:widowControl w:val="0"/>
+              <w:spacing w:line="240" w:lineRule="auto"/>
+              <w:jc w:val="center"/>
+              <w:rPr/>
+            </w:pPr>
+            <w:r>
+              <w:rPr>
+                <w:rtl w:val="0"/>
+              </w:rPr>
+              <w:t xml:space="preserve">2019</w:t>
+            </w:r>
+          </w:p>
+        </w:tc>
+        <w:tc>
+          <w:tcPr>
+            <w:vAlign w:val="center"/>
+          </w:tcPr>
+          <w:p>
+            <w:pPr>
+              <w:widowControl w:val="0"/>
+              <w:spacing w:line="240" w:lineRule="auto"/>
+              <w:jc w:val="center"/>
+              <w:rPr/>
+            </w:pPr>
+            <w:r>
+              <w:rPr>
+                <w:rtl w:val="0"/>
+              </w:rPr>
+              <w:t xml:space="preserve">49</w:t>
+            </w:r>
+          </w:p>
+        </w:tc>
+      </w:tr>
+      <w:tr>
+        <w:trPr>
+          <w:cantSplit w:val="0"/>
+          <w:tblHeader w:val="0"/>
+        </w:trPr>
+        <w:tc>
+          <w:tcPr/>
+          <w:p>
+            <w:pPr>
+              <w:widowControl w:val="0"/>
+              <w:spacing w:line="240" w:lineRule="auto"/>
+              <w:jc w:val="both"/>
+              <w:rPr/>
+            </w:pPr>
+            <w:r>
+              <w:rPr>
+                <w:rtl w:val="0"/>
+              </w:rPr>
+              <w:t xml:space="preserve">Número de alunos matriculados na graduação presencial residentes em campo mourão e região</w:t>
+            </w:r>
+          </w:p>
+        </w:tc>
+        <w:tc>
+          <w:tcPr>
+            <w:vAlign w:val="center"/>
+          </w:tcPr>
+          <w:p>
+            <w:pPr>
+              <w:widowControl w:val="0"/>
+              <w:spacing w:line="240" w:lineRule="auto"/>
+              <w:jc w:val="center"/>
+              <w:rPr/>
+            </w:pPr>
+            <w:r>
+              <w:rPr>
+                <w:rtl w:val="0"/>
+              </w:rPr>
+              <w:t xml:space="preserve">2018</w:t>
+            </w:r>
+          </w:p>
+        </w:tc>
+        <w:tc>
+          <w:tcPr>
+            <w:vAlign w:val="center"/>
+          </w:tcPr>
+          <w:p>
+            <w:pPr>
+              <w:widowControl w:val="0"/>
+              <w:spacing w:line="240" w:lineRule="auto"/>
+              <w:jc w:val="center"/>
+              <w:rPr/>
+            </w:pPr>
+            <w:r>
+              <w:rPr>
+                <w:rtl w:val="0"/>
+              </w:rPr>
+              <w:t xml:space="preserve">50</w:t>
+            </w:r>
+          </w:p>
+        </w:tc>
+      </w:tr>
+      <w:tr>
+        <w:trPr>
+          <w:cantSplit w:val="0"/>
+          <w:tblHeader w:val="0"/>
+        </w:trPr>
+        <w:tc>
+          <w:tcPr/>
+          <w:p>
+            <w:pPr>
+              <w:widowControl w:val="0"/>
+              <w:spacing w:line="240" w:lineRule="auto"/>
+              <w:jc w:val="both"/>
+              <w:rPr/>
+            </w:pPr>
+            <w:r>
+              <w:rPr>
+                <w:rtl w:val="0"/>
+              </w:rPr>
+              <w:t xml:space="preserve">Alunos residentes em Campo Mourão, na região ou outros estados – em %</w:t>
+            </w:r>
+          </w:p>
+        </w:tc>
+        <w:tc>
+          <w:tcPr>
+            <w:vAlign w:val="center"/>
+          </w:tcPr>
+          <w:p>
+            <w:pPr>
+              <w:widowControl w:val="0"/>
+              <w:spacing w:line="240" w:lineRule="auto"/>
+              <w:jc w:val="center"/>
+              <w:rPr/>
+            </w:pPr>
+            <w:r>
+              <w:rPr>
+                <w:rtl w:val="0"/>
+              </w:rPr>
+              <w:t xml:space="preserve">2019</w:t>
+            </w:r>
+          </w:p>
+        </w:tc>
+        <w:tc>
+          <w:tcPr>
+            <w:vAlign w:val="center"/>
+          </w:tcPr>
+          <w:p>
+            <w:pPr>
+              <w:widowControl w:val="0"/>
+              <w:spacing w:line="240" w:lineRule="auto"/>
+              <w:jc w:val="center"/>
+              <w:rPr/>
+            </w:pPr>
+            <w:r>
+              <w:rPr>
+                <w:rtl w:val="0"/>
+              </w:rPr>
+              <w:t xml:space="preserve">50</w:t>
+            </w:r>
+          </w:p>
+        </w:tc>
+      </w:tr>
+      <w:tr>
+        <w:trPr>
+          <w:cantSplit w:val="0"/>
+          <w:tblHeader w:val="0"/>
+        </w:trPr>
+        <w:tc>
+          <w:tcPr/>
+          <w:p>
+            <w:pPr>
+              <w:widowControl w:val="0"/>
+              <w:spacing w:line="240" w:lineRule="auto"/>
+              <w:jc w:val="both"/>
+              <w:rPr/>
+            </w:pPr>
+            <w:r>
+              <w:rPr>
+                <w:rtl w:val="0"/>
+              </w:rPr>
+              <w:t xml:space="preserve">SAÚDE – PANORAMA GERAL DE CAMPO MOURÃO (“Estabelecimentos de Saúde” e “Leitos Hospitalares Existentes” já estão atualizados)</w:t>
+            </w:r>
+          </w:p>
+        </w:tc>
+        <w:tc>
+          <w:tcPr>
+            <w:vAlign w:val="center"/>
+          </w:tcPr>
+          <w:p>
+            <w:pPr>
+              <w:widowControl w:val="0"/>
+              <w:spacing w:line="240" w:lineRule="auto"/>
+              <w:jc w:val="center"/>
+              <w:rPr/>
+            </w:pPr>
+            <w:r>
+              <w:rPr>
+                <w:rtl w:val="0"/>
+              </w:rPr>
+              <w:t xml:space="preserve">2010 - 2017</w:t>
+            </w:r>
+          </w:p>
+        </w:tc>
+        <w:tc>
+          <w:tcPr>
+            <w:vAlign w:val="center"/>
+          </w:tcPr>
+          <w:p>
+            <w:pPr>
+              <w:widowControl w:val="0"/>
+              <w:spacing w:line="240" w:lineRule="auto"/>
+              <w:jc w:val="center"/>
+              <w:rPr/>
+            </w:pPr>
+            <w:r>
+              <w:rPr>
+                <w:rtl w:val="0"/>
+              </w:rPr>
+              <w:t xml:space="preserve">57</w:t>
+            </w:r>
+          </w:p>
+        </w:tc>
+      </w:tr>
+      <w:tr>
+        <w:trPr>
+          <w:cantSplit w:val="0"/>
+          <w:tblHeader w:val="0"/>
+        </w:trPr>
+        <w:tc>
+          <w:tcPr/>
+          <w:p>
+            <w:pPr>
+              <w:widowControl w:val="0"/>
+              <w:spacing w:line="240" w:lineRule="auto"/>
+              <w:jc w:val="both"/>
+              <w:rPr/>
+            </w:pPr>
+            <w:r>
+              <w:rPr>
+                <w:rtl w:val="0"/>
+              </w:rPr>
+              <w:t xml:space="preserve">Total de Recursos Financeiros aplicados em saúde por Habitante</w:t>
+            </w:r>
+          </w:p>
+        </w:tc>
+        <w:tc>
+          <w:tcPr>
+            <w:vAlign w:val="center"/>
+          </w:tcPr>
+          <w:p>
+            <w:pPr>
+              <w:widowControl w:val="0"/>
+              <w:spacing w:line="240" w:lineRule="auto"/>
+              <w:jc w:val="center"/>
+              <w:rPr/>
+            </w:pPr>
+            <w:r>
+              <w:rPr>
+                <w:rtl w:val="0"/>
+              </w:rPr>
+              <w:t xml:space="preserve">2017 - 2018</w:t>
+            </w:r>
+          </w:p>
+        </w:tc>
+        <w:tc>
+          <w:tcPr>
+            <w:vAlign w:val="center"/>
+          </w:tcPr>
+          <w:p>
+            <w:pPr>
+              <w:widowControl w:val="0"/>
+              <w:spacing w:line="240" w:lineRule="auto"/>
+              <w:jc w:val="center"/>
+              <w:rPr/>
+            </w:pPr>
+            <w:r>
+              <w:rPr>
+                <w:rtl w:val="0"/>
+              </w:rPr>
+              <w:t xml:space="preserve">57</w:t>
+            </w:r>
+          </w:p>
+        </w:tc>
+      </w:tr>
+      <w:tr>
+        <w:trPr>
+          <w:cantSplit w:val="0"/>
+          <w:tblHeader w:val="0"/>
+        </w:trPr>
+        <w:tc>
+          <w:tcPr/>
+          <w:p>
+            <w:pPr>
+              <w:widowControl w:val="0"/>
+              <w:spacing w:line="240" w:lineRule="auto"/>
+              <w:jc w:val="both"/>
+              <w:rPr/>
+            </w:pPr>
+            <w:r>
+              <w:rPr>
+                <w:rtl w:val="0"/>
+              </w:rPr>
+              <w:t xml:space="preserve">Percentual de Despesas com saúde por habitante</w:t>
+            </w:r>
+          </w:p>
+        </w:tc>
+        <w:tc>
+          <w:tcPr>
+            <w:vAlign w:val="center"/>
+          </w:tcPr>
+          <w:p>
+            <w:pPr>
+              <w:widowControl w:val="0"/>
+              <w:spacing w:line="240" w:lineRule="auto"/>
+              <w:jc w:val="center"/>
+              <w:rPr/>
+            </w:pPr>
+            <w:r>
+              <w:rPr>
+                <w:rtl w:val="0"/>
+              </w:rPr>
+              <w:t xml:space="preserve">2017 - 2018</w:t>
+            </w:r>
+          </w:p>
+        </w:tc>
+        <w:tc>
+          <w:tcPr>
+            <w:vAlign w:val="center"/>
+          </w:tcPr>
+          <w:p>
+            <w:pPr>
+              <w:widowControl w:val="0"/>
+              <w:spacing w:line="240" w:lineRule="auto"/>
+              <w:jc w:val="center"/>
+              <w:rPr/>
+            </w:pPr>
+            <w:r>
+              <w:rPr>
+                <w:rtl w:val="0"/>
+              </w:rPr>
+              <w:t xml:space="preserve">58</w:t>
+            </w:r>
+          </w:p>
+        </w:tc>
+      </w:tr>
+      <w:tr>
+        <w:trPr>
+          <w:cantSplit w:val="0"/>
+          <w:tblHeader w:val="0"/>
+        </w:trPr>
+        <w:tc>
+          <w:tcPr/>
+          <w:p>
+            <w:pPr>
+              <w:widowControl w:val="0"/>
+              <w:spacing w:line="240" w:lineRule="auto"/>
+              <w:jc w:val="both"/>
+              <w:rPr/>
+            </w:pPr>
+            <w:r>
+              <w:rPr>
+                <w:rtl w:val="0"/>
+              </w:rPr>
+              <w:t xml:space="preserve">Percentual de Despesas com assistência hospitalar e ambulatorial por habitante</w:t>
+            </w:r>
+          </w:p>
+        </w:tc>
+        <w:tc>
+          <w:tcPr>
+            <w:vAlign w:val="center"/>
+          </w:tcPr>
+          <w:p>
+            <w:pPr>
+              <w:widowControl w:val="0"/>
+              <w:spacing w:line="240" w:lineRule="auto"/>
+              <w:jc w:val="center"/>
+              <w:rPr/>
+            </w:pPr>
+            <w:r>
+              <w:rPr>
+                <w:rtl w:val="0"/>
+              </w:rPr>
+              <w:t xml:space="preserve">2017 - 2018</w:t>
+            </w:r>
+          </w:p>
+        </w:tc>
+        <w:tc>
+          <w:tcPr>
+            <w:vAlign w:val="center"/>
+          </w:tcPr>
+          <w:p>
+            <w:pPr>
+              <w:widowControl w:val="0"/>
+              <w:spacing w:line="240" w:lineRule="auto"/>
+              <w:jc w:val="center"/>
+              <w:rPr/>
+            </w:pPr>
+            <w:r>
+              <w:rPr>
+                <w:rtl w:val="0"/>
+              </w:rPr>
+              <w:t xml:space="preserve">58</w:t>
+            </w:r>
+          </w:p>
+        </w:tc>
+      </w:tr>
+      <w:tr>
+        <w:trPr>
+          <w:cantSplit w:val="0"/>
+          <w:tblHeader w:val="0"/>
+        </w:trPr>
+        <w:tc>
+          <w:tcPr/>
+          <w:p>
+            <w:pPr>
+              <w:widowControl w:val="0"/>
+              <w:spacing w:line="240" w:lineRule="auto"/>
+              <w:jc w:val="both"/>
+              <w:rPr/>
+            </w:pPr>
+            <w:r>
+              <w:rPr>
+                <w:rtl w:val="0"/>
+              </w:rPr>
+              <w:t xml:space="preserve">EQUIPAMENTOS CULTURAIS – 2017 (só falta atualizar o “Outros espaços”)</w:t>
+            </w:r>
+          </w:p>
+        </w:tc>
+        <w:tc>
+          <w:tcPr>
+            <w:vAlign w:val="center"/>
+          </w:tcPr>
+          <w:p>
+            <w:pPr>
+              <w:widowControl w:val="0"/>
+              <w:spacing w:line="240" w:lineRule="auto"/>
+              <w:jc w:val="center"/>
+              <w:rPr/>
+            </w:pPr>
+            <w:r>
+              <w:rPr>
+                <w:rtl w:val="0"/>
+              </w:rPr>
+              <w:t xml:space="preserve">2017</w:t>
+            </w:r>
+          </w:p>
+        </w:tc>
+        <w:tc>
+          <w:tcPr>
+            <w:vAlign w:val="center"/>
+          </w:tcPr>
+          <w:p>
+            <w:pPr>
+              <w:widowControl w:val="0"/>
+              <w:spacing w:line="240" w:lineRule="auto"/>
+              <w:jc w:val="center"/>
+              <w:rPr/>
+            </w:pPr>
+            <w:r>
+              <w:rPr>
+                <w:rtl w:val="0"/>
+              </w:rPr>
+              <w:t xml:space="preserve">61</w:t>
             </w:r>
           </w:p>
         </w:tc>

</xml_diff>